<commit_message>
Applied task 3 relational algebra
</commit_message>
<xml_diff>
--- a/Applied/App03/at3_ra.docx
+++ b/Applied/App03/at3_ra.docx
@@ -2,7 +2,329 @@
 <file path=word/document.xml><?xml version="1.0" encoding="utf-8"?>
 <w:document xmlns:wpc="http://schemas.microsoft.com/office/word/2010/wordprocessingCanvas" xmlns:cx="http://schemas.microsoft.com/office/drawing/2014/chartex" xmlns:cx1="http://schemas.microsoft.com/office/drawing/2015/9/8/chartex" xmlns:cx2="http://schemas.microsoft.com/office/drawing/2015/10/21/chartex" xmlns:cx3="http://schemas.microsoft.com/office/drawing/2016/5/9/chartex" xmlns:cx4="http://schemas.microsoft.com/office/drawing/2016/5/10/chartex" xmlns:cx5="http://schemas.microsoft.com/office/drawing/2016/5/11/chartex" xmlns:cx6="http://schemas.microsoft.com/office/drawing/2016/5/12/chartex" xmlns:cx7="http://schemas.microsoft.com/office/drawing/2016/5/13/chartex" xmlns:cx8="http://schemas.microsoft.com/office/drawing/2016/5/14/chartex" xmlns:mc="http://schemas.openxmlformats.org/markup-compatibility/2006" xmlns:aink="http://schemas.microsoft.com/office/drawing/2016/ink" xmlns:am3d="http://schemas.microsoft.com/office/drawing/2017/model3d" xmlns:o="urn:schemas-microsoft-com:office:office" xmlns:oel="http://schemas.microsoft.com/office/2019/extlst" xmlns:r="http://schemas.openxmlformats.org/officeDocument/2006/relationships" xmlns:m="http://schemas.openxmlformats.org/officeDocument/2006/math" xmlns:v="urn:schemas-microsoft-com:vml" xmlns:wp14="http://schemas.microsoft.com/office/word/2010/wordprocessingDrawing" xmlns:wp="http://schemas.openxmlformats.org/drawingml/2006/wordprocessingDrawing" xmlns:w10="urn:schemas-microsoft-com:office:word" xmlns:w="http://schemas.openxmlformats.org/wordprocessingml/2006/main" xmlns:w14="http://schemas.microsoft.com/office/word/2010/wordml" xmlns:w15="http://schemas.microsoft.com/office/word/2012/wordml" xmlns:w16cex="http://schemas.microsoft.com/office/word/2018/wordml/cex" xmlns:w16cid="http://schemas.microsoft.com/office/word/2016/wordml/cid" xmlns:w16="http://schemas.microsoft.com/office/word/2018/wordml" xmlns:w16du="http://schemas.microsoft.com/office/word/2023/wordml/word16du" xmlns:w16sdtdh="http://schemas.microsoft.com/office/word/2020/wordml/sdtdatahash" xmlns:w16sdtfl="http://schemas.microsoft.com/office/word/2024/wordml/sdtformatlock" xmlns:w16se="http://schemas.microsoft.com/office/word/2015/wordml/symex" xmlns:wpg="http://schemas.microsoft.com/office/word/2010/wordprocessingGroup" xmlns:wpi="http://schemas.microsoft.com/office/word/2010/wordprocessingInk" xmlns:wne="http://schemas.microsoft.com/office/word/2006/wordml" xmlns:wps="http://schemas.microsoft.com/office/word/2010/wordprocessingShape" mc:Ignorable="w14 w15 w16se w16cid w16 w16cex w16sdtdh w16sdtfl w16du wp14">
   <w:body>
-    <w:p/>
+    <w:p>
+      <w:pPr>
+        <w:rPr>
+          <w:rFonts w:asciiTheme="majorBidi" w:hAnsiTheme="majorBidi"/>
+          <w:u w:val="single"/>
+          <w:lang w:val="en-US"/>
+        </w:rPr>
+      </w:pPr>
+      <w:r>
+        <w:rPr>
+          <w:rFonts w:asciiTheme="majorBidi" w:hAnsiTheme="majorBidi"/>
+          <w:u w:val="single"/>
+          <w:lang w:val="en-US"/>
+        </w:rPr>
+        <w:t>Applied Task 3</w:t>
+      </w:r>
+    </w:p>
+    <w:p>
+      <w:pPr>
+        <w:rPr>
+          <w:rFonts w:asciiTheme="majorBidi" w:hAnsiTheme="majorBidi"/>
+          <w:lang w:val="en-US"/>
+        </w:rPr>
+      </w:pPr>
+      <w:r>
+        <w:rPr>
+          <w:rFonts w:asciiTheme="majorBidi" w:hAnsiTheme="majorBidi"/>
+          <w:lang w:val="en-US"/>
+        </w:rPr>
+        <w:t>Ria Bansal</w:t>
+      </w:r>
+      <w:r>
+        <w:rPr>
+          <w:rFonts w:asciiTheme="majorBidi" w:hAnsiTheme="majorBidi"/>
+          <w:lang w:val="en-US"/>
+        </w:rPr>
+        <w:br/>
+        <w:t>Student ID:34267433</w:t>
+      </w:r>
+    </w:p>
+    <w:p>
+      <w:pPr>
+        <w:rPr>
+          <w:rFonts w:asciiTheme="majorBidi" w:hAnsiTheme="majorBidi"/>
+          <w:sz w:val="28"/>
+          <w:szCs w:val="28"/>
+          <w:lang w:val="en-US"/>
+        </w:rPr>
+      </w:pPr>
+    </w:p>
+    <w:p>
+      <w:pPr>
+        <w:rPr>
+          <w:rFonts w:asciiTheme="majorBidi" w:hAnsiTheme="majorBidi"/>
+          <w:lang w:val="en-US"/>
+        </w:rPr>
+      </w:pPr>
+    </w:p>
+    <w:p>
+      <w:pPr>
+        <w:spacing w:line="240" w:lineRule="auto"/>
+        <w:rPr>
+          <w:rFonts w:asciiTheme="majorBidi" w:hAnsiTheme="majorBidi"/>
+          <w:lang w:val="en-US"/>
+        </w:rPr>
+      </w:pPr>
+      <w:r>
+        <w:rPr>
+          <w:rFonts w:asciiTheme="majorBidi" w:hAnsiTheme="majorBidi"/>
+          <w:lang w:val="en-US"/>
+        </w:rPr>
+        <w:t xml:space="preserve">RESULT = </w:t>
+      </w:r>
+      <m:oMath>
+        <m:r>
+          <w:rPr>
+            <w:rFonts w:ascii="Cambria Math" w:hAnsi="Cambria Math"/>
+            <w:lang w:val="en-US"/>
+          </w:rPr>
+          <m:t>π</m:t>
+        </m:r>
+      </m:oMath>
+      <w:r>
+        <w:rPr>
+          <w:rFonts w:asciiTheme="majorBidi" w:hAnsiTheme="majorBidi"/>
+          <w:lang w:val="en-US"/>
+        </w:rPr>
+        <w:t xml:space="preserve"> hotel_no, hotel_name, room_no, room_type (</w:t>
+      </w:r>
+    </w:p>
+    <w:p>
+      <w:pPr>
+        <w:spacing w:line="240" w:lineRule="auto"/>
+        <w:rPr>
+          <w:rFonts w:asciiTheme="majorBidi" w:hAnsiTheme="majorBidi"/>
+          <w:lang w:val="en-US"/>
+        </w:rPr>
+      </w:pPr>
+      <w:r>
+        <w:rPr>
+          <w:rFonts w:asciiTheme="majorBidi" w:hAnsiTheme="majorBidi"/>
+          <w:lang w:val="en-US"/>
+        </w:rPr>
+        <w:t xml:space="preserve">    (HOTEL </w:t>
+      </w:r>
+      <m:oMath>
+        <m:r>
+          <w:rPr>
+            <w:rFonts w:ascii="Cambria Math" w:hAnsi="Cambria Math" w:cs="Cambria Math"/>
+            <w:lang w:val="en-US"/>
+          </w:rPr>
+          <m:t>⋈</m:t>
+        </m:r>
+      </m:oMath>
+      <w:r>
+        <w:rPr>
+          <w:rFonts w:asciiTheme="majorBidi" w:hAnsiTheme="majorBidi"/>
+          <w:lang w:val="en-US"/>
+        </w:rPr>
+        <w:t xml:space="preserve"> ROOM)</w:t>
+      </w:r>
+    </w:p>
+    <w:p>
+      <w:pPr>
+        <w:spacing w:line="240" w:lineRule="auto"/>
+        <w:rPr>
+          <w:rFonts w:asciiTheme="majorBidi" w:hAnsiTheme="majorBidi"/>
+          <w:lang w:val="en-US"/>
+        </w:rPr>
+      </w:pPr>
+      <w:r>
+        <w:rPr>
+          <w:rFonts w:asciiTheme="majorBidi" w:hAnsiTheme="majorBidi"/>
+          <w:lang w:val="en-US"/>
+        </w:rPr>
+        <w:t xml:space="preserve">    -</w:t>
+      </w:r>
+    </w:p>
+    <w:p>
+      <w:pPr>
+        <w:spacing w:line="240" w:lineRule="auto"/>
+        <w:rPr>
+          <w:rFonts w:asciiTheme="majorBidi" w:hAnsiTheme="majorBidi"/>
+          <w:lang w:val="en-US"/>
+        </w:rPr>
+      </w:pPr>
+      <w:r>
+        <w:rPr>
+          <w:rFonts w:asciiTheme="majorBidi" w:hAnsiTheme="majorBidi"/>
+          <w:lang w:val="en-US"/>
+        </w:rPr>
+        <w:t xml:space="preserve">   </w:t>
+      </w:r>
+      <m:oMath>
+        <m:r>
+          <w:rPr>
+            <w:rFonts w:ascii="Cambria Math" w:hAnsi="Cambria Math"/>
+            <w:lang w:val="en-US"/>
+          </w:rPr>
+          <m:t xml:space="preserve"> π</m:t>
+        </m:r>
+      </m:oMath>
+      <w:r>
+        <w:rPr>
+          <w:rFonts w:asciiTheme="majorBidi" w:hAnsiTheme="majorBidi"/>
+          <w:lang w:val="en-US"/>
+        </w:rPr>
+        <w:t xml:space="preserve"> hotel_no, hotel_name, room_no, room_type (</w:t>
+      </w:r>
+    </w:p>
+    <w:p>
+      <w:pPr>
+        <w:spacing w:line="240" w:lineRule="auto"/>
+        <w:rPr>
+          <w:rFonts w:asciiTheme="majorBidi" w:hAnsiTheme="majorBidi"/>
+          <w:lang w:val="en-US"/>
+        </w:rPr>
+      </w:pPr>
+      <w:r>
+        <w:rPr>
+          <w:rFonts w:asciiTheme="majorBidi" w:hAnsiTheme="majorBidi"/>
+          <w:lang w:val="en-US"/>
+        </w:rPr>
+        <w:t xml:space="preserve">        (HOTEL </w:t>
+      </w:r>
+      <m:oMath>
+        <m:r>
+          <w:rPr>
+            <w:rFonts w:ascii="Cambria Math" w:hAnsi="Cambria Math" w:cs="Cambria Math"/>
+            <w:lang w:val="en-US"/>
+          </w:rPr>
+          <m:t>⋈</m:t>
+        </m:r>
+      </m:oMath>
+      <w:r>
+        <w:rPr>
+          <w:rFonts w:asciiTheme="majorBidi" w:hAnsiTheme="majorBidi"/>
+          <w:lang w:val="en-US"/>
+        </w:rPr>
+        <w:t xml:space="preserve"> ROOM) </w:t>
+      </w:r>
+      <m:oMath>
+        <m:r>
+          <w:rPr>
+            <w:rFonts w:ascii="Cambria Math" w:hAnsi="Cambria Math" w:cs="Cambria Math"/>
+            <w:lang w:val="en-US"/>
+          </w:rPr>
+          <m:t>⋈</m:t>
+        </m:r>
+      </m:oMath>
+    </w:p>
+    <w:p>
+      <w:pPr>
+        <w:spacing w:line="240" w:lineRule="auto"/>
+        <w:rPr>
+          <w:rFonts w:asciiTheme="majorBidi" w:hAnsiTheme="majorBidi"/>
+          <w:lang w:val="en-US"/>
+        </w:rPr>
+      </w:pPr>
+      <w:r>
+        <w:rPr>
+          <w:rFonts w:asciiTheme="majorBidi" w:hAnsiTheme="majorBidi"/>
+          <w:lang w:val="en-US"/>
+        </w:rPr>
+        <w:t xml:space="preserve">        σ (</w:t>
+      </w:r>
+      <w:proofErr w:type="spellStart"/>
+      <w:r>
+        <w:rPr>
+          <w:rFonts w:asciiTheme="majorBidi" w:hAnsiTheme="majorBidi"/>
+          <w:lang w:val="en-US"/>
+        </w:rPr>
+        <w:t>bdate_from</w:t>
+      </w:r>
+      <w:proofErr w:type="spellEnd"/>
+      <w:r>
+        <w:rPr>
+          <w:rFonts w:asciiTheme="majorBidi" w:hAnsiTheme="majorBidi"/>
+          <w:lang w:val="en-US"/>
+        </w:rPr>
+        <w:t xml:space="preserve"> </w:t>
+      </w:r>
+      <m:oMath>
+        <m:r>
+          <w:rPr>
+            <w:rFonts w:ascii="Cambria Math" w:hAnsi="Cambria Math"/>
+            <w:lang w:val="en-US"/>
+          </w:rPr>
+          <m:t>&lt;=</m:t>
+        </m:r>
+      </m:oMath>
+      <w:r>
+        <w:rPr>
+          <w:rFonts w:asciiTheme="majorBidi" w:hAnsiTheme="majorBidi"/>
+          <w:lang w:val="en-US"/>
+        </w:rPr>
+        <w:t xml:space="preserve"> '20260330' </w:t>
+      </w:r>
+      <m:oMath>
+        <m:r>
+          <w:rPr>
+            <w:rFonts w:ascii="Cambria Math" w:hAnsi="Cambria Math" w:cs="Cambria Math"/>
+            <w:lang w:val="en-US"/>
+          </w:rPr>
+          <m:t>∧</m:t>
+        </m:r>
+      </m:oMath>
+      <w:r>
+        <w:rPr>
+          <w:rFonts w:asciiTheme="majorBidi" w:hAnsiTheme="majorBidi"/>
+          <w:lang w:val="en-US"/>
+        </w:rPr>
+        <w:t xml:space="preserve"> bdate_to </w:t>
+      </w:r>
+      <m:oMath>
+        <m:r>
+          <w:rPr>
+            <w:rFonts w:ascii="Cambria Math" w:hAnsi="Cambria Math"/>
+            <w:lang w:val="en-US"/>
+          </w:rPr>
+          <m:t xml:space="preserve">&gt;= </m:t>
+        </m:r>
+      </m:oMath>
+      <w:r>
+        <w:rPr>
+          <w:rFonts w:asciiTheme="majorBidi" w:hAnsiTheme="majorBidi"/>
+          <w:lang w:val="en-US"/>
+        </w:rPr>
+        <w:t>'20260328') (BOOKING)</w:t>
+      </w:r>
+    </w:p>
+    <w:p>
+      <w:pPr>
+        <w:spacing w:line="240" w:lineRule="auto"/>
+        <w:rPr>
+          <w:rFonts w:asciiTheme="majorBidi" w:hAnsiTheme="majorBidi"/>
+          <w:lang w:val="en-US"/>
+        </w:rPr>
+      </w:pPr>
+      <w:r>
+        <w:rPr>
+          <w:rFonts w:asciiTheme="majorBidi" w:hAnsiTheme="majorBidi"/>
+          <w:lang w:val="en-US"/>
+        </w:rPr>
+        <w:t xml:space="preserve">    )</w:t>
+      </w:r>
+    </w:p>
+    <w:p>
+      <w:pPr>
+        <w:spacing w:line="240" w:lineRule="auto"/>
+        <w:rPr>
+          <w:rFonts w:asciiTheme="majorBidi" w:hAnsiTheme="majorBidi"/>
+          <w:lang w:val="en-US"/>
+        </w:rPr>
+      </w:pPr>
+      <w:r>
+        <w:rPr>
+          <w:rFonts w:asciiTheme="majorBidi" w:hAnsiTheme="majorBidi"/>
+          <w:lang w:val="en-US"/>
+        </w:rPr>
+        <w:t>)</w:t>
+      </w:r>
+    </w:p>
     <w:sectPr>
       <w:pgSz w:w="11906" w:h="16838"/>
       <w:pgMar w:top="1440" w:right="1440" w:bottom="1440" w:left="1440" w:header="708" w:footer="708" w:gutter="0"/>
@@ -930,6 +1252,16 @@
       <w:spacing w:val="5"/>
     </w:rPr>
   </w:style>
+  <w:style w:type="character" w:styleId="PlaceholderText">
+    <w:name w:val="Placeholder Text"/>
+    <w:basedOn w:val="DefaultParagraphFont"/>
+    <w:uiPriority w:val="99"/>
+    <w:semiHidden/>
+    <w:rsid w:val="00443976"/>
+    <w:rPr>
+      <w:color w:val="666666"/>
+    </w:rPr>
+  </w:style>
 </w:styles>
 </file>
 

</xml_diff>